<commit_message>
Renumber D3.2 draft from Section 5 to Section 1; update permission allowlist
</commit_message>
<xml_diff>
--- a/deliverable/D3.2_T3.2_XAI_GNN_draft_v0.1.docx
+++ b/deliverable/D3.2_T3.2_XAI_GNN_draft_v0.1.docx
@@ -122,7 +122,7 @@
         <w:pStyle w:val="Heading1"/>
       </w:pPr>
       <w:r>
-        <w:t>5  Critical and Comparative Study of XAI Approaches for GNN-based QoS Prediction in SDN Network Automation</w:t>
+        <w:t>1  Critical and Comparative Study of XAI Approaches for GNN-based QoS Prediction in SDN Network Automation</w:t>
       </w:r>
     </w:p>
     <w:p>
@@ -130,7 +130,7 @@
         <w:pStyle w:val="Heading2"/>
       </w:pPr>
       <w:r>
-        <w:t>5.1  Introduction</w:t>
+        <w:t>1.1  Introduction</w:t>
       </w:r>
     </w:p>
     <w:p>
@@ -165,7 +165,7 @@
         <w:pStyle w:val="Heading2"/>
       </w:pPr>
       <w:r>
-        <w:t>5.2  Background</w:t>
+        <w:t>1.2  Background</w:t>
       </w:r>
     </w:p>
     <w:p>
@@ -173,7 +173,7 @@
         <w:pStyle w:val="Heading3"/>
       </w:pPr>
       <w:r>
-        <w:t>5.2.1  RouteNet-Fermi</w:t>
+        <w:t>1.2.1  RouteNet-Fermi</w:t>
       </w:r>
     </w:p>
     <w:p>
@@ -190,7 +190,7 @@
         <w:pStyle w:val="Heading3"/>
       </w:pPr>
       <w:r>
-        <w:t>5.2.2  Compared XAI methods</w:t>
+        <w:t>1.2.2  Compared XAI methods</w:t>
       </w:r>
     </w:p>
     <w:p>
@@ -225,7 +225,7 @@
         <w:pStyle w:val="Heading3"/>
       </w:pPr>
       <w:r>
-        <w:t>5.2.3  Fidelity evaluation by retraining (ROAR)</w:t>
+        <w:t>1.2.3  Fidelity evaluation by retraining (ROAR)</w:t>
       </w:r>
     </w:p>
     <w:p>
@@ -242,7 +242,7 @@
         <w:pStyle w:val="Heading2"/>
       </w:pPr>
       <w:r>
-        <w:t>5.3  Dataset and Feature Scope</w:t>
+        <w:t>1.3  Dataset and Feature Scope</w:t>
       </w:r>
     </w:p>
     <w:p>
@@ -250,7 +250,7 @@
         <w:pStyle w:val="Heading3"/>
       </w:pPr>
       <w:r>
-        <w:t>5.3.1  Dataset</w:t>
+        <w:t>1.3.1  Dataset</w:t>
       </w:r>
     </w:p>
     <w:p>
@@ -259,7 +259,7 @@
           <w:b w:val="0"/>
           <w:i w:val="0"/>
         </w:rPr>
-        <w:t>All experiments use the public BNN-UPC dataset-v6-traffic-models corpus (the dataset of the RouteNet-Fermi paper’s traffic-models experiment), sub-experiment delay. It contains five sub-datasets by traffic model: constant_bitrate, onoff, autocorrelated (exponentials), modulated (exponentials), and all_multiplexed, in which flows of all classes coexist. Topologies: NSFNET (14 nodes) and GEANT2 (24 nodes) in training, GBN (17 nodes) in test. The study targets all_multiplexed — the hardest and most realistic sub-configuration — for all XAI work; the other four are used once, in the baseline validity check (Section 5.4.1). The all_multiplexed training split contains 15,039 simulations; the test split is disjoint and topology-shifted (GBN unseen in training). The prediction target is per-flow average delay.</w:t>
+        <w:t>All experiments use the public BNN-UPC dataset-v6-traffic-models corpus (the dataset of the RouteNet-Fermi paper’s traffic-models experiment), sub-experiment delay. It contains five sub-datasets by traffic model: constant_bitrate, onoff, autocorrelated (exponentials), modulated (exponentials), and all_multiplexed, in which flows of all classes coexist. Topologies: NSFNET (14 nodes) and GEANT2 (24 nodes) in training, GBN (17 nodes) in test. The study targets all_multiplexed — the hardest and most realistic sub-configuration — for all XAI work; the other four are used once, in the baseline validity check (Section 1.4.1). The all_multiplexed training split contains 15,039 simulations; the test split is disjoint and topology-shifted (GBN unseen in training). The prediction target is per-flow average delay.</w:t>
       </w:r>
     </w:p>
     <w:p>
@@ -267,7 +267,7 @@
         <w:pStyle w:val="Heading3"/>
       </w:pPr>
       <w:r>
-        <w:t>5.3.2  Feature scope: 10 rankable scalars vs. 12 structural inputs</w:t>
+        <w:t>1.3.2  Feature scope: 10 rankable scalars vs. 12 structural inputs</w:t>
       </w:r>
     </w:p>
     <w:p>
@@ -290,7 +290,7 @@
           <w:color w:val="1F3B66"/>
           <w:sz w:val="20"/>
         </w:rPr>
-        <w:t>Table 5-1: Input feature scope.</w:t>
+        <w:t>Table 1-1: Input feature scope.</w:t>
       </w:r>
     </w:p>
     <w:tbl>
@@ -512,7 +512,7 @@
         <w:pStyle w:val="Heading2"/>
       </w:pPr>
       <w:r>
-        <w:t>5.4  Methodology and Completed Pipeline Steps</w:t>
+        <w:t>1.4  Methodology and Completed Pipeline Steps</w:t>
       </w:r>
     </w:p>
     <w:p>
@@ -520,7 +520,7 @@
         <w:pStyle w:val="Heading3"/>
       </w:pPr>
       <w:r>
-        <w:t>5.4.1  Environment and baseline validation (Steps 1, 2.5)</w:t>
+        <w:t>1.4.1  Environment and baseline validation (Steps 1, 2.5)</w:t>
       </w:r>
     </w:p>
     <w:p>
@@ -543,7 +543,7 @@
           <w:color w:val="1F3B66"/>
           <w:sz w:val="20"/>
         </w:rPr>
-        <w:t>Table 5-2: Reproduction of RouteNet-Fermi paper Table V (delay MAPE) on N = 300 test simulations per sub-dataset.</w:t>
+        <w:t>Table 1-2: Reproduction of RouteNet-Fermi paper Table V (delay MAPE) on N = 300 test simulations per sub-dataset.</w:t>
       </w:r>
     </w:p>
     <w:tbl>
@@ -939,7 +939,7 @@
         <w:pStyle w:val="Heading3"/>
       </w:pPr>
       <w:r>
-        <w:t>5.4.2  XAI implementation and verification (Step 3)</w:t>
+        <w:t>1.4.2  XAI implementation and verification (Step 3)</w:t>
       </w:r>
     </w:p>
     <w:p>
@@ -1026,7 +1026,7 @@
         <w:pStyle w:val="Heading3"/>
       </w:pPr>
       <w:r>
-        <w:t>5.4.3  Preregistration (Step 3.5)</w:t>
+        <w:t>1.4.3  Preregistration (Step 3.5)</w:t>
       </w:r>
     </w:p>
     <w:p>
@@ -1043,7 +1043,7 @@
         <w:pStyle w:val="Heading3"/>
       </w:pPr>
       <w:r>
-        <w:t>5.4.4  Explanation generation (Step 4)</w:t>
+        <w:t>1.4.4  Explanation generation (Step 4)</w:t>
       </w:r>
     </w:p>
     <w:p>
@@ -1103,7 +1103,7 @@
           <w:b w:val="0"/>
           <w:i w:val="0"/>
         </w:rPr>
-        <w:t>In addition, both methods were re-run with an alternative reference (the training-set mean instead of the median) on all 300 simulations, providing a reference-sensitivity (stability) measurement reported in Section 5.5.3.</w:t>
+        <w:t>In addition, both methods were re-run with an alternative reference (the training-set mean instead of the median) on all 300 simulations, providing a reference-sensitivity (stability) measurement reported in Section 1.5.3.</w:t>
       </w:r>
     </w:p>
     <w:p>
@@ -1111,7 +1111,7 @@
         <w:pStyle w:val="Heading3"/>
       </w:pPr>
       <w:r>
-        <w:t>5.4.5  Global ranking construction (Step 5)</w:t>
+        <w:t>1.4.5  Global ranking construction (Step 5)</w:t>
       </w:r>
     </w:p>
     <w:p>
@@ -1128,7 +1128,7 @@
         <w:pStyle w:val="Heading3"/>
       </w:pPr>
       <w:r>
-        <w:t>5.4.6  Reduced-input variant design (Step 6)</w:t>
+        <w:t>1.4.6  Reduced-input variant design (Step 6)</w:t>
       </w:r>
     </w:p>
     <w:p>
@@ -1154,7 +1154,7 @@
         <w:pStyle w:val="Heading2"/>
       </w:pPr>
       <w:r>
-        <w:t>5.5  Results of the Completed Phases</w:t>
+        <w:t>1.5  Results of the Completed Phases</w:t>
       </w:r>
     </w:p>
     <w:p>
@@ -1162,7 +1162,7 @@
         <w:pStyle w:val="Heading3"/>
       </w:pPr>
       <w:r>
-        <w:t>5.5.1  Global feature rankings</w:t>
+        <w:t>1.5.1  Global feature rankings</w:t>
       </w:r>
     </w:p>
     <w:p>
@@ -1176,7 +1176,7 @@
           <w:color w:val="1F3B66"/>
           <w:sz w:val="20"/>
         </w:rPr>
-        <w:t>Table 5-3: Global feature rankings (mean absolute attribution over 300 simulations, median reference).</w:t>
+        <w:t>Table 1-3: Global feature rankings (mean absolute attribution over 300 simulations, median reference).</w:t>
       </w:r>
     </w:p>
     <w:tbl>
@@ -2019,7 +2019,7 @@
         <w:pStyle w:val="Heading3"/>
       </w:pPr>
       <w:r>
-        <w:t>5.5.2  Cross-method agreement and sample sufficiency</w:t>
+        <w:t>1.5.2  Cross-method agreement and sample sufficiency</w:t>
       </w:r>
     </w:p>
     <w:p>
@@ -2033,7 +2033,7 @@
           <w:color w:val="1F3B66"/>
           <w:sz w:val="20"/>
         </w:rPr>
-        <w:t>Table 5-4: Agreement and sufficiency checks.</w:t>
+        <w:t>Table 1-4: Agreement and sufficiency checks.</w:t>
       </w:r>
     </w:p>
     <w:tbl>
@@ -2313,7 +2313,7 @@
         <w:pStyle w:val="Heading3"/>
       </w:pPr>
       <w:r>
-        <w:t>5.5.3  Reference-sensitivity (stability) check</w:t>
+        <w:t>1.5.3  Reference-sensitivity (stability) check</w:t>
       </w:r>
     </w:p>
     <w:p>
@@ -2327,7 +2327,7 @@
           <w:color w:val="1F3B66"/>
           <w:sz w:val="20"/>
         </w:rPr>
-        <w:t>Table 5-5: Ranking stability under change of reference point.</w:t>
+        <w:t>Table 1-5: Ranking stability under change of reference point.</w:t>
       </w:r>
     </w:p>
     <w:tbl>
@@ -2504,7 +2504,7 @@
         <w:pStyle w:val="Heading3"/>
       </w:pPr>
       <w:r>
-        <w:t>5.5.4  Random control</w:t>
+        <w:t>1.5.4  Random control</w:t>
       </w:r>
     </w:p>
     <w:p>
@@ -2521,7 +2521,7 @@
         <w:pStyle w:val="Heading2"/>
       </w:pPr>
       <w:r>
-        <w:t>5.6  Work in Progress: Retraining Campaign and Fidelity Analysis</w:t>
+        <w:t>1.6  Work in Progress: Retraining Campaign and Fidelity Analysis</w:t>
       </w:r>
     </w:p>
     <w:p>
@@ -2530,7 +2530,7 @@
           <w:b w:val="0"/>
           <w:i w:val="0"/>
         </w:rPr>
-        <w:t>The 13 training configurations of Section 5.4.6 are scheduled on the project’s reference compute (NVIDIA RTX 4090). All runs use the exact training protocol of the reference paper — 150 epochs × 2,000 samples, Adam (lr = 0.001), MAPE loss, hidden state 32, T = 8 message-passing iterations, seed 42, identical data splits — so that the only varying factor across the matrix is the input feature set. Evaluation is on the full all_multiplexed test split.</w:t>
+        <w:t>The 13 training configurations of Section 1.4.6 are scheduled on the project’s reference compute (NVIDIA RTX 4090). All runs use the exact training protocol of the reference paper — 150 epochs × 2,000 samples, Adam (lr = 0.001), MAPE loss, hidden state 32, T = 8 message-passing iterations, seed 42, identical data splits — so that the only varying factor across the matrix is the input feature set. Evaluation is on the full all_multiplexed test split.</w:t>
       </w:r>
     </w:p>
     <w:p>
@@ -2544,7 +2544,7 @@
           <w:color w:val="1F3B66"/>
           <w:sz w:val="20"/>
         </w:rPr>
-        <w:t>Table 5-6: Retraining matrix (Step 7).</w:t>
+        <w:t>Table 1-6: Retraining matrix (Step 7).</w:t>
       </w:r>
     </w:p>
     <w:tbl>
@@ -2809,7 +2809,7 @@
         <w:pStyle w:val="Heading2"/>
       </w:pPr>
       <w:r>
-        <w:t>5.7  Conclusion (Interim)</w:t>
+        <w:t>1.7  Conclusion (Interim)</w:t>
       </w:r>
     </w:p>
     <w:p>
@@ -2826,7 +2826,7 @@
         <w:pStyle w:val="Heading2"/>
       </w:pPr>
       <w:r>
-        <w:t>5.8  References</w:t>
+        <w:t>1.8  References</w:t>
       </w:r>
     </w:p>
     <w:p>

</xml_diff>

<commit_message>
Finalize docs and deliverable for public release
</commit_message>
<xml_diff>
--- a/deliverable/D3.2_T3.2_XAI_GNN_draft_v0.1.docx
+++ b/deliverable/D3.2_T3.2_XAI_GNN_draft_v0.1.docx
@@ -49,7 +49,7 @@
           <w:color w:val="B03030"/>
           <w:sz w:val="20"/>
         </w:rPr>
-        <w:t>DRAFT v0.2 — internal review version (Dana Dagher / Mouna Ben Mabrouk). Covers completed work: pipeline Steps 1 to 6, including the post-Step-5 design decisions (method-equivalence finding, threshold choice, and stated limitations — Sections 1.5.5–1.5.6). Retraining campaign (Step 7) and fidelity results (Step 8) to be added in the next revision.</w:t>
+        <w:t>DRAFT v0.2 — internal review version. Covers completed work: pipeline Steps 1 to 6, including the post-Step-5 design decisions (method-equivalence finding, threshold choice, and stated limitations — Sections 1.5.5–1.5.6). Retraining campaign (Step 7) and fidelity results (Step 8) to be added in the next revision.</w:t>
       </w:r>
     </w:p>
     <w:p>
@@ -132,8 +132,6 @@
     <w:p>
       <w:r>
         <w:t xml:space="preserve">Integrated Gradients (IG) attributes a prediction to each input feature by accumulating the model’s gradients along a straight-line path from a reference (baseline) input to the actual </w:t>
-      </w:r>
-      <w:r>
         <w:lastRenderedPageBreak/>
         <w:t>input. It is white-box (requires gradients), exact in the limit of fine interpolation, and satisfies completeness (attributions sum to the difference between prediction and baseline prediction).</w:t>
       </w:r>
@@ -823,8 +821,6 @@
     <w:p>
       <w:r>
         <w:t xml:space="preserve">Both methods were implemented against the unmodified pretrained model, with the explanation target defined as the predicted delay of one reference flow (flow index 0) per simulation, attributed over its 10 path scalars while the rest of the graph (all other flows, </w:t>
-      </w:r>
-      <w:r>
         <w:lastRenderedPageBreak/>
         <w:t>queues, links, topology) is held fixed. Key implementation choices, locked before any result was inspected:</w:t>
       </w:r>
@@ -983,8 +979,6 @@
     <w:p>
       <w:r>
         <w:t xml:space="preserve">Per-method global rankings are obtained by averaging absolute attributions over the 300 simulations and sorting. Statistical sufficiency of the explanation budget was tested by a half-split check: rankings computed independently on simulations 0–149 and 150–299 are </w:t>
-      </w:r>
-      <w:r>
         <w:lastRenderedPageBreak/>
         <w:t>compared by Spearman rank correlation, with ρ ≥ 0.7 preregistered as the acceptance threshold.</w:t>
       </w:r>
@@ -1835,8 +1829,6 @@
     <w:p>
       <w:r>
         <w:t xml:space="preserve">The headline structural finding is a cliff between ranks 3 and 4: the top-3 features (sigma, traffic, packets) carry ≈93 % of the total attribution mass (IG 92.9 %, KernelSHAP 93.3 %), </w:t>
-      </w:r>
-      <w:r>
         <w:lastRenderedPageBreak/>
         <w:t>with a ≈20× magnitude drop to the rank-4 feature for both methods. The bottom-7 features form a flat near-noise tail. Physically, this is coherent: traffic and packets determine link load and packet size — the primary delay drivers in queueing terms — while sigma, the modulation amplitude of modulated-traffic flows, governs delay variance for that traffic class and is structurally zero for all others, making it highly informative when present.</w:t>
       </w:r>
@@ -2320,8 +2312,6 @@
     <w:p>
       <w:r>
         <w:t xml:space="preserve">A structural consequence of the cross-method agreement was identified before launching the retraining campaign and reshapes the study. The IG and KernelSHAP rankings differ only by </w:t>
-      </w:r>
-      <w:r>
         <w:lastRenderedPageBreak/>
         <w:t>three adjacent transpositions (ranks 1–2, 4–5 and 6–7); none of the partition cut points (after the 3rd, 5th and 7th feature) falls between a transposed pair. Consequently, at every (k, partition) cell the two methods select the identical set of kept features — verified by an automated set-equality check over all six cells. Because the model concatenates path scalars in a fixed canonical order, identical feature sets yield identical retrained models. Three consequences follow:</w:t>
       </w:r>
@@ -2651,8 +2641,6 @@
       </w:r>
       <w:r>
         <w:t xml:space="preserve">traffic and packets cannot be fully removed (they feed the load and packet-size computations), so any fidelity gap that relies on removing them </w:t>
-      </w:r>
-      <w:r>
         <w:lastRenderedPageBreak/>
         <w:t>is a lower bound; the retraining test most cleanly validates the eight fully-removable scalars plus sigma. This structural floor is identical across every variant — principled, random and baseline alike — so the principled-vs-random contrast remains valid; at worst it compresses the dynamic range, which would itself be informative (the model would be shown to rely mainly on the queueing physics, the learned path features adding a secondary correction).</w:t>
       </w:r>

</xml_diff>